<commit_message>
Scrum: actualización de minutas de reuniones (daily y retrospectiva)
</commit_message>
<xml_diff>
--- a/Fase 2/Evidencias Proyecto/Evidencias de documentación/2. Metodología Scrum/REUNIONES/Retrospectiva_Sprint3.docx
+++ b/Fase 2/Evidencias Proyecto/Evidencias de documentación/2. Metodología Scrum/REUNIONES/Retrospectiva_Sprint3.docx
@@ -6,239 +6,485 @@
       <w:pPr>
         <w:rPr>
           <w:rFonts w:ascii="Arial" w:hAnsi="Arial" w:cs="Arial"/>
-          <w:b/>
-          <w:bCs/>
-        </w:rPr>
-      </w:pPr>
-      <w:r>
-        <w:rPr>
-          <w:rFonts w:ascii="Arial" w:hAnsi="Arial" w:cs="Arial"/>
-          <w:b/>
-          <w:bCs/>
-        </w:rPr>
-        <w:t>SITRAFO — Retrospectiva de Cierre (Sprint 3)</w:t>
-      </w:r>
-    </w:p>
-    <w:p>
-      <w:pPr>
-        <w:rPr>
-          <w:rFonts w:ascii="Arial" w:hAnsi="Arial" w:cs="Arial"/>
-        </w:rPr>
-      </w:pPr>
-      <w:r>
-        <w:rPr>
-          <w:rFonts w:ascii="Arial" w:hAnsi="Arial" w:cs="Arial"/>
-        </w:rPr>
-        <w:t xml:space="preserve">Proyecto: SITRAFO (Transformadores Olivares </w:t>
+        </w:rPr>
+      </w:pPr>
+    </w:p>
+    <w:p>
+      <w:pPr>
+        <w:rPr>
+          <w:rFonts w:ascii="Arial" w:hAnsi="Arial" w:cs="Arial"/>
+        </w:rPr>
+      </w:pPr>
+    </w:p>
+    <w:p>
+      <w:pPr>
+        <w:rPr>
+          <w:rFonts w:ascii="Arial" w:hAnsi="Arial" w:cs="Arial"/>
+        </w:rPr>
+      </w:pPr>
+    </w:p>
+    <w:p>
+      <w:pPr>
+        <w:rPr>
+          <w:rFonts w:ascii="Arial" w:hAnsi="Arial" w:cs="Arial"/>
+        </w:rPr>
+      </w:pPr>
+    </w:p>
+    <w:p>
+      <w:pPr>
+        <w:rPr>
+          <w:rFonts w:ascii="Arial" w:hAnsi="Arial" w:cs="Arial"/>
+        </w:rPr>
+      </w:pPr>
+    </w:p>
+    <w:p>
+      <w:pPr>
+        <w:rPr>
+          <w:rFonts w:ascii="Arial" w:hAnsi="Arial" w:cs="Arial"/>
+        </w:rPr>
+      </w:pPr>
+    </w:p>
+    <w:p>
+      <w:pPr>
+        <w:rPr>
+          <w:rFonts w:ascii="Arial" w:hAnsi="Arial" w:cs="Arial"/>
+        </w:rPr>
+      </w:pPr>
+    </w:p>
+    <w:p>
+      <w:pPr>
+        <w:rPr>
+          <w:rFonts w:ascii="Arial" w:hAnsi="Arial" w:cs="Arial"/>
+        </w:rPr>
+      </w:pPr>
+    </w:p>
+    <w:p>
+      <w:pPr>
+        <w:rPr>
+          <w:rFonts w:ascii="Arial" w:hAnsi="Arial" w:cs="Arial"/>
+        </w:rPr>
+      </w:pPr>
+    </w:p>
+    <w:p>
+      <w:pPr>
+        <w:rPr>
+          <w:rFonts w:ascii="Arial" w:hAnsi="Arial" w:cs="Arial"/>
+        </w:rPr>
+      </w:pPr>
+    </w:p>
+    <w:p>
+      <w:pPr>
+        <w:pStyle w:val="NormalWeb"/>
+        <w:spacing w:before="0" w:beforeAutospacing="0" w:after="0" w:afterAutospacing="0"/>
+        <w:ind w:left="1416"/>
+        <w:jc w:val="right"/>
+        <w:rPr>
+          <w:sz w:val="22"/>
+          <w:szCs w:val="22"/>
+        </w:rPr>
+      </w:pPr>
+      <w:r>
+        <w:rPr>
+          <w:rFonts w:ascii="Calibri" w:hAnsi="Calibri" w:cs="Calibri"/>
+          <w:b/>
+          <w:bCs/>
+          <w:color w:val="000000"/>
+          <w:sz w:val="44"/>
+          <w:szCs w:val="44"/>
+        </w:rPr>
+        <w:t>RETROESPECTIVA DE CIERRE (SPRINT 3)</w:t>
+      </w:r>
+    </w:p>
+    <w:p>
+      <w:pPr>
+        <w:pStyle w:val="NormalWeb"/>
+        <w:spacing w:before="0" w:beforeAutospacing="0" w:after="0" w:afterAutospacing="0"/>
+        <w:jc w:val="right"/>
+        <w:rPr>
+          <w:rFonts w:ascii="Calibri" w:hAnsi="Calibri" w:cs="Calibri"/>
+          <w:b/>
+          <w:bCs/>
+          <w:color w:val="000000"/>
+          <w:sz w:val="44"/>
+          <w:szCs w:val="44"/>
+        </w:rPr>
+      </w:pPr>
+      <w:r>
+        <w:rPr>
+          <w:rFonts w:ascii="Calibri" w:hAnsi="Calibri" w:cs="Calibri"/>
+          <w:b/>
+          <w:bCs/>
+          <w:color w:val="000000"/>
+          <w:sz w:val="44"/>
+          <w:szCs w:val="44"/>
+        </w:rPr>
+        <w:t> “SITRAFO”</w:t>
+      </w:r>
+    </w:p>
+    <w:p>
+      <w:pPr>
+        <w:pStyle w:val="NormalWeb"/>
+        <w:spacing w:before="0" w:beforeAutospacing="0" w:after="0" w:afterAutospacing="0"/>
+        <w:jc w:val="right"/>
+      </w:pPr>
+      <w:r>
+        <w:rPr>
+          <w:rFonts w:ascii="Calibri" w:hAnsi="Calibri" w:cs="Calibri"/>
+          <w:b/>
+          <w:bCs/>
+          <w:i/>
+          <w:iCs/>
+          <w:color w:val="000000"/>
+          <w:sz w:val="36"/>
+          <w:szCs w:val="36"/>
+        </w:rPr>
+        <w:t>Fecha:</w:t>
+      </w:r>
+      <w:r>
+        <w:rPr>
+          <w:rFonts w:ascii="Calibri" w:hAnsi="Calibri" w:cs="Calibri"/>
+          <w:b/>
+          <w:bCs/>
+          <w:i/>
+          <w:iCs/>
+          <w:color w:val="00B050"/>
+          <w:sz w:val="36"/>
+          <w:szCs w:val="36"/>
+        </w:rPr>
+        <w:t>13/10/2026</w:t>
+      </w:r>
+    </w:p>
+    <w:p>
+      <w:pPr>
+        <w:jc w:val="right"/>
+        <w:rPr>
+          <w:rFonts w:cstheme="minorHAnsi"/>
+          <w:b/>
+          <w:bCs/>
+          <w:sz w:val="28"/>
+          <w:szCs w:val="28"/>
+        </w:rPr>
+      </w:pPr>
+    </w:p>
+    <w:p>
+      <w:pPr>
+        <w:jc w:val="right"/>
+        <w:rPr>
+          <w:rFonts w:cstheme="minorHAnsi"/>
+          <w:b/>
+          <w:bCs/>
+          <w:sz w:val="28"/>
+          <w:szCs w:val="28"/>
+        </w:rPr>
+      </w:pPr>
+    </w:p>
+    <w:p>
+      <w:pPr>
+        <w:jc w:val="right"/>
+        <w:rPr>
+          <w:rFonts w:cstheme="minorHAnsi"/>
+          <w:b/>
+          <w:bCs/>
+          <w:sz w:val="28"/>
+          <w:szCs w:val="28"/>
+        </w:rPr>
+      </w:pPr>
+    </w:p>
+    <w:p>
+      <w:pPr>
+        <w:jc w:val="right"/>
+        <w:rPr>
+          <w:rFonts w:cstheme="minorHAnsi"/>
+          <w:b/>
+          <w:bCs/>
+          <w:sz w:val="28"/>
+          <w:szCs w:val="28"/>
+        </w:rPr>
+      </w:pPr>
+    </w:p>
+    <w:p>
+      <w:pPr>
+        <w:jc w:val="right"/>
+        <w:rPr>
+          <w:rFonts w:cstheme="minorHAnsi"/>
+          <w:b/>
+          <w:bCs/>
+          <w:sz w:val="28"/>
+          <w:szCs w:val="28"/>
+        </w:rPr>
+      </w:pPr>
+    </w:p>
+    <w:p>
+      <w:pPr>
+        <w:jc w:val="right"/>
+        <w:rPr>
+          <w:rFonts w:cstheme="minorHAnsi"/>
+          <w:b/>
+          <w:bCs/>
+          <w:sz w:val="28"/>
+          <w:szCs w:val="28"/>
+        </w:rPr>
+      </w:pPr>
+    </w:p>
+    <w:p>
+      <w:pPr>
+        <w:jc w:val="right"/>
+        <w:rPr>
+          <w:rFonts w:cstheme="minorHAnsi"/>
+          <w:b/>
+          <w:bCs/>
+          <w:sz w:val="28"/>
+          <w:szCs w:val="28"/>
+        </w:rPr>
+      </w:pPr>
+    </w:p>
+    <w:p>
+      <w:pPr>
+        <w:jc w:val="right"/>
+        <w:rPr>
+          <w:rFonts w:cstheme="minorHAnsi"/>
+          <w:b/>
+          <w:bCs/>
+          <w:sz w:val="28"/>
+          <w:szCs w:val="28"/>
+        </w:rPr>
+      </w:pPr>
+    </w:p>
+    <w:p>
+      <w:pPr>
+        <w:jc w:val="right"/>
+        <w:rPr>
+          <w:rFonts w:cstheme="minorHAnsi"/>
+          <w:b/>
+          <w:bCs/>
+          <w:sz w:val="28"/>
+          <w:szCs w:val="28"/>
+        </w:rPr>
+      </w:pPr>
+    </w:p>
+    <w:p>
+      <w:pPr>
+        <w:jc w:val="right"/>
+        <w:rPr>
+          <w:rFonts w:cstheme="minorHAnsi"/>
+          <w:b/>
+          <w:bCs/>
+          <w:sz w:val="28"/>
+          <w:szCs w:val="28"/>
+        </w:rPr>
+      </w:pPr>
+      <w:r>
+        <w:rPr>
+          <w:rFonts w:cstheme="minorHAnsi"/>
+          <w:b/>
+          <w:bCs/>
+          <w:sz w:val="28"/>
+          <w:szCs w:val="28"/>
+        </w:rPr>
+        <w:t>Facilitadora: Camila Olivares (Scrum Master)</w:t>
+      </w:r>
+    </w:p>
+    <w:p>
+      <w:pPr>
+        <w:jc w:val="right"/>
+        <w:rPr>
+          <w:rFonts w:cstheme="minorHAnsi"/>
+          <w:b/>
+          <w:bCs/>
+          <w:sz w:val="28"/>
+          <w:szCs w:val="28"/>
+        </w:rPr>
+      </w:pPr>
+      <w:r>
+        <w:rPr>
+          <w:rFonts w:cstheme="minorHAnsi"/>
+          <w:b/>
+          <w:bCs/>
+          <w:sz w:val="28"/>
+          <w:szCs w:val="28"/>
+        </w:rPr>
+        <w:t xml:space="preserve">Asistentes: Camila Olivares, Benjamín Delgado, </w:t>
       </w:r>
       <w:proofErr w:type="spellStart"/>
       <w:r>
         <w:rPr>
-          <w:rFonts w:ascii="Arial" w:hAnsi="Arial" w:cs="Arial"/>
-        </w:rPr>
-        <w:t>SpA</w:t>
+          <w:rFonts w:cstheme="minorHAnsi"/>
+          <w:b/>
+          <w:bCs/>
+          <w:sz w:val="28"/>
+          <w:szCs w:val="28"/>
+        </w:rPr>
+        <w:t>Milko</w:t>
       </w:r>
       <w:proofErr w:type="spellEnd"/>
       <w:r>
         <w:rPr>
-          <w:rFonts w:ascii="Arial" w:hAnsi="Arial" w:cs="Arial"/>
-        </w:rPr>
-        <w:t>)</w:t>
-      </w:r>
-    </w:p>
-    <w:p>
-      <w:pPr>
-        <w:rPr>
-          <w:rFonts w:ascii="Arial" w:hAnsi="Arial" w:cs="Arial"/>
-        </w:rPr>
-      </w:pPr>
-      <w:r>
-        <w:rPr>
-          <w:rFonts w:ascii="Arial" w:hAnsi="Arial" w:cs="Arial"/>
-        </w:rPr>
-        <w:t>Fecha: 13 de octubre de 2026</w:t>
-      </w:r>
-    </w:p>
-    <w:p>
-      <w:pPr>
-        <w:rPr>
-          <w:rFonts w:ascii="Arial" w:hAnsi="Arial" w:cs="Arial"/>
-        </w:rPr>
-      </w:pPr>
-      <w:r>
-        <w:rPr>
-          <w:rFonts w:ascii="Arial" w:hAnsi="Arial" w:cs="Arial"/>
-        </w:rPr>
-        <w:t>Facilitadora: Camila Olivares (Scrum Master)</w:t>
-      </w:r>
-    </w:p>
-    <w:p>
-      <w:pPr>
-        <w:rPr>
-          <w:rFonts w:ascii="Arial" w:hAnsi="Arial" w:cs="Arial"/>
-        </w:rPr>
-      </w:pPr>
-      <w:r>
-        <w:rPr>
-          <w:rFonts w:ascii="Arial" w:hAnsi="Arial" w:cs="Arial"/>
-        </w:rPr>
-        <w:t xml:space="preserve">Asistentes: Camila Olivares, Benjamín Delgado, </w:t>
+          <w:rFonts w:cstheme="minorHAnsi"/>
+          <w:b/>
+          <w:bCs/>
+          <w:sz w:val="28"/>
+          <w:szCs w:val="28"/>
+        </w:rPr>
+        <w:t xml:space="preserve"> Soto</w:t>
+      </w:r>
+    </w:p>
+    <w:p>
+      <w:pPr>
+        <w:jc w:val="right"/>
+        <w:rPr>
+          <w:rFonts w:ascii="Arial" w:hAnsi="Arial" w:cs="Arial"/>
+        </w:rPr>
+      </w:pPr>
+    </w:p>
+    <w:p>
+      <w:pPr>
+        <w:rPr>
+          <w:rFonts w:ascii="Arial" w:hAnsi="Arial" w:cs="Arial"/>
+        </w:rPr>
+      </w:pPr>
+    </w:p>
+    <w:p>
+      <w:pPr>
+        <w:rPr>
+          <w:rFonts w:ascii="Arial" w:hAnsi="Arial" w:cs="Arial"/>
+        </w:rPr>
+      </w:pPr>
+    </w:p>
+    <w:p>
+      <w:pPr>
+        <w:rPr>
+          <w:rFonts w:ascii="Arial" w:hAnsi="Arial" w:cs="Arial"/>
+        </w:rPr>
+      </w:pPr>
+      <w:r>
+        <w:rPr>
+          <w:rFonts w:ascii="Arial" w:hAnsi="Arial" w:cs="Arial"/>
+        </w:rPr>
+        <w:lastRenderedPageBreak/>
+        <w:t>1. ¿Qué funcionó bien durante el proyecto?</w:t>
+      </w:r>
+    </w:p>
+    <w:p>
+      <w:pPr>
+        <w:rPr>
+          <w:rFonts w:ascii="Arial" w:hAnsi="Arial" w:cs="Arial"/>
+        </w:rPr>
+      </w:pPr>
+      <w:r>
+        <w:rPr>
+          <w:rFonts w:ascii="Arial" w:hAnsi="Arial" w:cs="Arial"/>
+        </w:rPr>
+        <w:t>• La correcta estructuración y control de versiones en GitHub Desktop para los artefactos Scrum.</w:t>
+      </w:r>
+    </w:p>
+    <w:p>
+      <w:pPr>
+        <w:rPr>
+          <w:rFonts w:ascii="Arial" w:hAnsi="Arial" w:cs="Arial"/>
+        </w:rPr>
+      </w:pPr>
+      <w:r>
+        <w:rPr>
+          <w:rFonts w:ascii="Arial" w:hAnsi="Arial" w:cs="Arial"/>
+        </w:rPr>
+        <w:t>• La articulación entre el portal web y la aplicación de escritorio para cubrir las historias de usuario de punta a punta.</w:t>
+      </w:r>
+    </w:p>
+    <w:p>
+      <w:pPr>
+        <w:rPr>
+          <w:rFonts w:ascii="Arial" w:hAnsi="Arial" w:cs="Arial"/>
+        </w:rPr>
+      </w:pPr>
+      <w:r>
+        <w:rPr>
+          <w:rFonts w:ascii="Arial" w:hAnsi="Arial" w:cs="Arial"/>
+        </w:rPr>
+        <w:t>• La comunicación fluida para resolver inconsistencias de nombres de archivos y formatos.</w:t>
+      </w:r>
+    </w:p>
+    <w:p>
+      <w:pPr>
+        <w:rPr>
+          <w:rFonts w:ascii="Arial" w:hAnsi="Arial" w:cs="Arial"/>
+        </w:rPr>
+      </w:pPr>
+    </w:p>
+    <w:p>
+      <w:pPr>
+        <w:rPr>
+          <w:rFonts w:ascii="Arial" w:hAnsi="Arial" w:cs="Arial"/>
+        </w:rPr>
+      </w:pPr>
+      <w:r>
+        <w:rPr>
+          <w:rFonts w:ascii="Arial" w:hAnsi="Arial" w:cs="Arial"/>
+        </w:rPr>
+        <w:t>2. ¿Qué no funcionó bien o se puede mejorar?</w:t>
+      </w:r>
+    </w:p>
+    <w:p>
+      <w:pPr>
+        <w:rPr>
+          <w:rFonts w:ascii="Arial" w:hAnsi="Arial" w:cs="Arial"/>
+        </w:rPr>
+      </w:pPr>
+      <w:r>
+        <w:rPr>
+          <w:rFonts w:ascii="Arial" w:hAnsi="Arial" w:cs="Arial"/>
+        </w:rPr>
+        <w:t>• Concentración de la carga de trabajo de documentación y pruebas en los días cercanos al cierre de la Fase 2.</w:t>
+      </w:r>
+    </w:p>
+    <w:p>
+      <w:pPr>
+        <w:rPr>
+          <w:rFonts w:ascii="Arial" w:hAnsi="Arial" w:cs="Arial"/>
+        </w:rPr>
+      </w:pPr>
+    </w:p>
+    <w:p>
+      <w:pPr>
+        <w:rPr>
+          <w:rFonts w:ascii="Arial" w:hAnsi="Arial" w:cs="Arial"/>
+        </w:rPr>
+      </w:pPr>
+      <w:r>
+        <w:rPr>
+          <w:rFonts w:ascii="Arial" w:hAnsi="Arial" w:cs="Arial"/>
+        </w:rPr>
+        <w:t>3. Acuerdos y Plan de Acción</w:t>
+      </w:r>
+    </w:p>
+    <w:p>
+      <w:pPr>
+        <w:rPr>
+          <w:rFonts w:ascii="Arial" w:hAnsi="Arial" w:cs="Arial"/>
+        </w:rPr>
+      </w:pPr>
+      <w:r>
+        <w:rPr>
+          <w:rFonts w:ascii="Arial" w:hAnsi="Arial" w:cs="Arial"/>
+        </w:rPr>
+        <w:t xml:space="preserve">• Mantener la práctica de realizar </w:t>
       </w:r>
       <w:proofErr w:type="spellStart"/>
       <w:r>
         <w:rPr>
           <w:rFonts w:ascii="Arial" w:hAnsi="Arial" w:cs="Arial"/>
         </w:rPr>
-        <w:t>Milko</w:t>
+        <w:t>commits</w:t>
       </w:r>
       <w:proofErr w:type="spellEnd"/>
       <w:r>
         <w:rPr>
           <w:rFonts w:ascii="Arial" w:hAnsi="Arial" w:cs="Arial"/>
         </w:rPr>
-        <w:t xml:space="preserve"> Soto</w:t>
-      </w:r>
-    </w:p>
-    <w:p>
-      <w:pPr>
-        <w:rPr>
-          <w:rFonts w:ascii="Arial" w:hAnsi="Arial" w:cs="Arial"/>
-        </w:rPr>
-      </w:pPr>
-    </w:p>
-    <w:p>
-      <w:pPr>
-        <w:rPr>
-          <w:rFonts w:ascii="Arial" w:hAnsi="Arial" w:cs="Arial"/>
-        </w:rPr>
-      </w:pPr>
-      <w:r>
-        <w:rPr>
-          <w:rFonts w:ascii="Arial" w:hAnsi="Arial" w:cs="Arial"/>
-        </w:rPr>
-        <w:t>1. ¿Qué funcionó bien durante el proyecto?</w:t>
-      </w:r>
-    </w:p>
-    <w:p>
-      <w:pPr>
-        <w:rPr>
-          <w:rFonts w:ascii="Arial" w:hAnsi="Arial" w:cs="Arial"/>
-        </w:rPr>
-      </w:pPr>
-      <w:r>
-        <w:rPr>
-          <w:rFonts w:ascii="Arial" w:hAnsi="Arial" w:cs="Arial"/>
-        </w:rPr>
-        <w:t>• La correcta estructuración y control de versiones en GitHub Desktop para los artefactos Scrum.</w:t>
-      </w:r>
-    </w:p>
-    <w:p>
-      <w:pPr>
-        <w:rPr>
-          <w:rFonts w:ascii="Arial" w:hAnsi="Arial" w:cs="Arial"/>
-        </w:rPr>
-      </w:pPr>
-      <w:r>
-        <w:rPr>
-          <w:rFonts w:ascii="Arial" w:hAnsi="Arial" w:cs="Arial"/>
-        </w:rPr>
-        <w:t>• La articulación entre el portal web y la aplicación de escritorio para cubrir las historias de usuario de punta a punta.</w:t>
-      </w:r>
-    </w:p>
-    <w:p>
-      <w:pPr>
-        <w:rPr>
-          <w:rFonts w:ascii="Arial" w:hAnsi="Arial" w:cs="Arial"/>
-        </w:rPr>
-      </w:pPr>
-      <w:r>
-        <w:rPr>
-          <w:rFonts w:ascii="Arial" w:hAnsi="Arial" w:cs="Arial"/>
-        </w:rPr>
-        <w:t>• La comunicación fluida para resolver inconsistencias de nombres de archivos y formatos.</w:t>
-      </w:r>
-    </w:p>
-    <w:p>
-      <w:pPr>
-        <w:rPr>
-          <w:rFonts w:ascii="Arial" w:hAnsi="Arial" w:cs="Arial"/>
-        </w:rPr>
-      </w:pPr>
-    </w:p>
-    <w:p>
-      <w:pPr>
-        <w:rPr>
-          <w:rFonts w:ascii="Arial" w:hAnsi="Arial" w:cs="Arial"/>
-        </w:rPr>
-      </w:pPr>
-      <w:r>
-        <w:rPr>
-          <w:rFonts w:ascii="Arial" w:hAnsi="Arial" w:cs="Arial"/>
-        </w:rPr>
-        <w:t>2. ¿Qué no funcionó bien o se puede mejorar?</w:t>
-      </w:r>
-    </w:p>
-    <w:p>
-      <w:pPr>
-        <w:rPr>
-          <w:rFonts w:ascii="Arial" w:hAnsi="Arial" w:cs="Arial"/>
-        </w:rPr>
-      </w:pPr>
-      <w:r>
-        <w:rPr>
-          <w:rFonts w:ascii="Arial" w:hAnsi="Arial" w:cs="Arial"/>
-        </w:rPr>
-        <w:t>• Concentración de la carga de trabajo de documentación y pruebas en los días cercanos al cierre de la Fase 2.</w:t>
-      </w:r>
-    </w:p>
-    <w:p>
-      <w:pPr>
-        <w:rPr>
-          <w:rFonts w:ascii="Arial" w:hAnsi="Arial" w:cs="Arial"/>
-        </w:rPr>
-      </w:pPr>
-    </w:p>
-    <w:p>
-      <w:pPr>
-        <w:rPr>
-          <w:rFonts w:ascii="Arial" w:hAnsi="Arial" w:cs="Arial"/>
-        </w:rPr>
-      </w:pPr>
-      <w:r>
-        <w:rPr>
-          <w:rFonts w:ascii="Arial" w:hAnsi="Arial" w:cs="Arial"/>
-        </w:rPr>
-        <w:t>3. Acuerdos y Plan de Acción</w:t>
-      </w:r>
-    </w:p>
-    <w:p>
-      <w:pPr>
-        <w:rPr>
-          <w:rFonts w:ascii="Arial" w:hAnsi="Arial" w:cs="Arial"/>
-        </w:rPr>
-      </w:pPr>
-      <w:r>
-        <w:rPr>
-          <w:rFonts w:ascii="Arial" w:hAnsi="Arial" w:cs="Arial"/>
-        </w:rPr>
-        <w:t xml:space="preserve">• Mantener la práctica de realizar </w:t>
-      </w:r>
-      <w:proofErr w:type="spellStart"/>
-      <w:r>
-        <w:rPr>
-          <w:rFonts w:ascii="Arial" w:hAnsi="Arial" w:cs="Arial"/>
-        </w:rPr>
-        <w:t>commits</w:t>
-      </w:r>
-      <w:proofErr w:type="spellEnd"/>
-      <w:r>
-        <w:rPr>
-          <w:rFonts w:ascii="Arial" w:hAnsi="Arial" w:cs="Arial"/>
-        </w:rPr>
         <w:t xml:space="preserve"> frecuentes y atómicos en GitHub Desktop para evitar acumulaciones al final de cada sprint.</w:t>
       </w:r>
     </w:p>
     <w:sectPr>
+      <w:headerReference w:type="default" r:id="rId6"/>
       <w:pgSz w:w="12240" w:h="15840"/>
       <w:pgMar w:top="1417" w:right="1701" w:bottom="1417" w:left="1701" w:header="708" w:footer="708" w:gutter="0"/>
       <w:cols w:space="708"/>
@@ -246,6 +492,119 @@
     </w:sectPr>
   </w:body>
 </w:document>
+</file>
+
+<file path=word/endnotes.xml><?xml version="1.0" encoding="utf-8"?>
+<w:endnotes xmlns:wpc="http://schemas.microsoft.com/office/word/2010/wordprocessingCanvas" xmlns:cx="http://schemas.microsoft.com/office/drawing/2014/chartex" xmlns:cx1="http://schemas.microsoft.com/office/drawing/2015/9/8/chartex" xmlns:cx2="http://schemas.microsoft.com/office/drawing/2015/10/21/chartex" xmlns:cx3="http://schemas.microsoft.com/office/drawing/2016/5/9/chartex" xmlns:cx4="http://schemas.microsoft.com/office/drawing/2016/5/10/chartex" xmlns:cx5="http://schemas.microsoft.com/office/drawing/2016/5/11/chartex" xmlns:cx6="http://schemas.microsoft.com/office/drawing/2016/5/12/chartex" xmlns:cx7="http://schemas.microsoft.com/office/drawing/2016/5/13/chartex" xmlns:cx8="http://schemas.microsoft.com/office/drawing/2016/5/14/chartex" xmlns:mc="http://schemas.openxmlformats.org/markup-compatibility/2006" xmlns:aink="http://schemas.microsoft.com/office/drawing/2016/ink" xmlns:am3d="http://schemas.microsoft.com/office/drawing/2017/model3d" xmlns:o="urn:schemas-microsoft-com:office:office" xmlns:r="http://schemas.openxmlformats.org/officeDocument/2006/relationships" xmlns:m="http://schemas.openxmlformats.org/officeDocument/2006/math" xmlns:v="urn:schemas-microsoft-com:vml" xmlns:wp14="http://schemas.microsoft.com/office/word/2010/wordprocessingDrawing" xmlns:wp="http://schemas.openxmlformats.org/drawingml/2006/wordprocessingDrawing" xmlns:w10="urn:schemas-microsoft-com:office:word" xmlns:w="http://schemas.openxmlformats.org/wordprocessingml/2006/main" xmlns:w14="http://schemas.microsoft.com/office/word/2010/wordml" xmlns:w15="http://schemas.microsoft.com/office/word/2012/wordml" xmlns:w16cex="http://schemas.microsoft.com/office/word/2018/wordml/cex" xmlns:w16cid="http://schemas.microsoft.com/office/word/2016/wordml/cid" xmlns:w16="http://schemas.microsoft.com/office/word/2018/wordml" xmlns:w16sdtdh="http://schemas.microsoft.com/office/word/2020/wordml/sdtdatahash" xmlns:w16se="http://schemas.microsoft.com/office/word/2015/wordml/symex" xmlns:wpg="http://schemas.microsoft.com/office/word/2010/wordprocessingGroup" xmlns:wpi="http://schemas.microsoft.com/office/word/2010/wordprocessingInk" xmlns:wne="http://schemas.microsoft.com/office/word/2006/wordml" xmlns:wps="http://schemas.microsoft.com/office/word/2010/wordprocessingShape" mc:Ignorable="w14 w15 w16se w16cid w16 w16cex w16sdtdh wp14">
+  <w:endnote w:type="separator" w:id="-1">
+    <w:p>
+      <w:pPr>
+        <w:spacing w:after="0" w:line="240" w:lineRule="auto"/>
+      </w:pPr>
+      <w:r>
+        <w:separator/>
+      </w:r>
+    </w:p>
+  </w:endnote>
+  <w:endnote w:type="continuationSeparator" w:id="0">
+    <w:p>
+      <w:pPr>
+        <w:spacing w:after="0" w:line="240" w:lineRule="auto"/>
+      </w:pPr>
+      <w:r>
+        <w:continuationSeparator/>
+      </w:r>
+    </w:p>
+  </w:endnote>
+</w:endnotes>
+</file>
+
+<file path=word/footnotes.xml><?xml version="1.0" encoding="utf-8"?>
+<w:footnotes xmlns:wpc="http://schemas.microsoft.com/office/word/2010/wordprocessingCanvas" xmlns:cx="http://schemas.microsoft.com/office/drawing/2014/chartex" xmlns:cx1="http://schemas.microsoft.com/office/drawing/2015/9/8/chartex" xmlns:cx2="http://schemas.microsoft.com/office/drawing/2015/10/21/chartex" xmlns:cx3="http://schemas.microsoft.com/office/drawing/2016/5/9/chartex" xmlns:cx4="http://schemas.microsoft.com/office/drawing/2016/5/10/chartex" xmlns:cx5="http://schemas.microsoft.com/office/drawing/2016/5/11/chartex" xmlns:cx6="http://schemas.microsoft.com/office/drawing/2016/5/12/chartex" xmlns:cx7="http://schemas.microsoft.com/office/drawing/2016/5/13/chartex" xmlns:cx8="http://schemas.microsoft.com/office/drawing/2016/5/14/chartex" xmlns:mc="http://schemas.openxmlformats.org/markup-compatibility/2006" xmlns:aink="http://schemas.microsoft.com/office/drawing/2016/ink" xmlns:am3d="http://schemas.microsoft.com/office/drawing/2017/model3d" xmlns:o="urn:schemas-microsoft-com:office:office" xmlns:r="http://schemas.openxmlformats.org/officeDocument/2006/relationships" xmlns:m="http://schemas.openxmlformats.org/officeDocument/2006/math" xmlns:v="urn:schemas-microsoft-com:vml" xmlns:wp14="http://schemas.microsoft.com/office/word/2010/wordprocessingDrawing" xmlns:wp="http://schemas.openxmlformats.org/drawingml/2006/wordprocessingDrawing" xmlns:w10="urn:schemas-microsoft-com:office:word" xmlns:w="http://schemas.openxmlformats.org/wordprocessingml/2006/main" xmlns:w14="http://schemas.microsoft.com/office/word/2010/wordml" xmlns:w15="http://schemas.microsoft.com/office/word/2012/wordml" xmlns:w16cex="http://schemas.microsoft.com/office/word/2018/wordml/cex" xmlns:w16cid="http://schemas.microsoft.com/office/word/2016/wordml/cid" xmlns:w16="http://schemas.microsoft.com/office/word/2018/wordml" xmlns:w16sdtdh="http://schemas.microsoft.com/office/word/2020/wordml/sdtdatahash" xmlns:w16se="http://schemas.microsoft.com/office/word/2015/wordml/symex" xmlns:wpg="http://schemas.microsoft.com/office/word/2010/wordprocessingGroup" xmlns:wpi="http://schemas.microsoft.com/office/word/2010/wordprocessingInk" xmlns:wne="http://schemas.microsoft.com/office/word/2006/wordml" xmlns:wps="http://schemas.microsoft.com/office/word/2010/wordprocessingShape" mc:Ignorable="w14 w15 w16se w16cid w16 w16cex w16sdtdh wp14">
+  <w:footnote w:type="separator" w:id="-1">
+    <w:p>
+      <w:pPr>
+        <w:spacing w:after="0" w:line="240" w:lineRule="auto"/>
+      </w:pPr>
+      <w:r>
+        <w:separator/>
+      </w:r>
+    </w:p>
+  </w:footnote>
+  <w:footnote w:type="continuationSeparator" w:id="0">
+    <w:p>
+      <w:pPr>
+        <w:spacing w:after="0" w:line="240" w:lineRule="auto"/>
+      </w:pPr>
+      <w:r>
+        <w:continuationSeparator/>
+      </w:r>
+    </w:p>
+  </w:footnote>
+</w:footnotes>
+</file>
+
+<file path=word/header1.xml><?xml version="1.0" encoding="utf-8"?>
+<w:hdr xmlns:wpc="http://schemas.microsoft.com/office/word/2010/wordprocessingCanvas" xmlns:cx="http://schemas.microsoft.com/office/drawing/2014/chartex" xmlns:cx1="http://schemas.microsoft.com/office/drawing/2015/9/8/chartex" xmlns:cx2="http://schemas.microsoft.com/office/drawing/2015/10/21/chartex" xmlns:cx3="http://schemas.microsoft.com/office/drawing/2016/5/9/chartex" xmlns:cx4="http://schemas.microsoft.com/office/drawing/2016/5/10/chartex" xmlns:cx5="http://schemas.microsoft.com/office/drawing/2016/5/11/chartex" xmlns:cx6="http://schemas.microsoft.com/office/drawing/2016/5/12/chartex" xmlns:cx7="http://schemas.microsoft.com/office/drawing/2016/5/13/chartex" xmlns:cx8="http://schemas.microsoft.com/office/drawing/2016/5/14/chartex" xmlns:mc="http://schemas.openxmlformats.org/markup-compatibility/2006" xmlns:aink="http://schemas.microsoft.com/office/drawing/2016/ink" xmlns:am3d="http://schemas.microsoft.com/office/drawing/2017/model3d" xmlns:o="urn:schemas-microsoft-com:office:office" xmlns:r="http://schemas.openxmlformats.org/officeDocument/2006/relationships" xmlns:m="http://schemas.openxmlformats.org/officeDocument/2006/math" xmlns:v="urn:schemas-microsoft-com:vml" xmlns:wp14="http://schemas.microsoft.com/office/word/2010/wordprocessingDrawing" xmlns:wp="http://schemas.openxmlformats.org/drawingml/2006/wordprocessingDrawing" xmlns:w10="urn:schemas-microsoft-com:office:word" xmlns:w="http://schemas.openxmlformats.org/wordprocessingml/2006/main" xmlns:w14="http://schemas.microsoft.com/office/word/2010/wordml" xmlns:w15="http://schemas.microsoft.com/office/word/2012/wordml" xmlns:w16cex="http://schemas.microsoft.com/office/word/2018/wordml/cex" xmlns:w16cid="http://schemas.microsoft.com/office/word/2016/wordml/cid" xmlns:w16="http://schemas.microsoft.com/office/word/2018/wordml" xmlns:w16sdtdh="http://schemas.microsoft.com/office/word/2020/wordml/sdtdatahash" xmlns:w16se="http://schemas.microsoft.com/office/word/2015/wordml/symex" xmlns:wpg="http://schemas.microsoft.com/office/word/2010/wordprocessingGroup" xmlns:wpi="http://schemas.microsoft.com/office/word/2010/wordprocessingInk" xmlns:wne="http://schemas.microsoft.com/office/word/2006/wordml" xmlns:wps="http://schemas.microsoft.com/office/word/2010/wordprocessingShape" mc:Ignorable="w14 w15 w16se w16cid w16 w16cex w16sdtdh wp14">
+  <w:p>
+    <w:pPr>
+      <w:pStyle w:val="Encabezado"/>
+    </w:pPr>
+    <w:r>
+      <w:rPr>
+        <w:noProof/>
+      </w:rPr>
+      <w:drawing>
+        <wp:inline distT="0" distB="0" distL="0" distR="0" wp14:anchorId="4FA489BA" wp14:editId="7644848D">
+          <wp:extent cx="933450" cy="228600"/>
+          <wp:effectExtent l="0" t="0" r="0" b="0"/>
+          <wp:docPr id="1" name="Imagen 1"/>
+          <wp:cNvGraphicFramePr>
+            <a:graphicFrameLocks xmlns:a="http://schemas.openxmlformats.org/drawingml/2006/main" noChangeAspect="1"/>
+          </wp:cNvGraphicFramePr>
+          <a:graphic xmlns:a="http://schemas.openxmlformats.org/drawingml/2006/main">
+            <a:graphicData uri="http://schemas.openxmlformats.org/drawingml/2006/picture">
+              <pic:pic xmlns:pic="http://schemas.openxmlformats.org/drawingml/2006/picture">
+                <pic:nvPicPr>
+                  <pic:cNvPr id="0" name="Picture 1"/>
+                  <pic:cNvPicPr>
+                    <a:picLocks noChangeAspect="1" noChangeArrowheads="1"/>
+                  </pic:cNvPicPr>
+                </pic:nvPicPr>
+                <pic:blipFill>
+                  <a:blip r:embed="rId1">
+                    <a:extLst>
+                      <a:ext uri="{28A0092B-C50C-407E-A947-70E740481C1C}">
+                        <a14:useLocalDpi xmlns:a14="http://schemas.microsoft.com/office/drawing/2010/main" val="0"/>
+                      </a:ext>
+                    </a:extLst>
+                  </a:blip>
+                  <a:srcRect/>
+                  <a:stretch>
+                    <a:fillRect/>
+                  </a:stretch>
+                </pic:blipFill>
+                <pic:spPr bwMode="auto">
+                  <a:xfrm>
+                    <a:off x="0" y="0"/>
+                    <a:ext cx="933450" cy="228600"/>
+                  </a:xfrm>
+                  <a:prstGeom prst="rect">
+                    <a:avLst/>
+                  </a:prstGeom>
+                  <a:noFill/>
+                  <a:ln>
+                    <a:noFill/>
+                  </a:ln>
+                </pic:spPr>
+              </pic:pic>
+            </a:graphicData>
+          </a:graphic>
+        </wp:inline>
+      </w:drawing>
+    </w:r>
+  </w:p>
+</w:hdr>
 </file>
 
 <file path=word/styles.xml><?xml version="1.0" encoding="utf-8"?>
@@ -674,6 +1033,67 @@
     <w:semiHidden/>
     <w:unhideWhenUsed/>
   </w:style>
+  <w:style w:type="paragraph" w:styleId="Encabezado">
+    <w:name w:val="header"/>
+    <w:basedOn w:val="Normal"/>
+    <w:link w:val="EncabezadoCar"/>
+    <w:uiPriority w:val="99"/>
+    <w:unhideWhenUsed/>
+    <w:rsid w:val="00ED75E1"/>
+    <w:pPr>
+      <w:tabs>
+        <w:tab w:val="center" w:pos="4419"/>
+        <w:tab w:val="right" w:pos="8838"/>
+      </w:tabs>
+      <w:spacing w:after="0" w:line="240" w:lineRule="auto"/>
+    </w:pPr>
+  </w:style>
+  <w:style w:type="character" w:customStyle="1" w:styleId="EncabezadoCar">
+    <w:name w:val="Encabezado Car"/>
+    <w:basedOn w:val="Fuentedeprrafopredeter"/>
+    <w:link w:val="Encabezado"/>
+    <w:uiPriority w:val="99"/>
+    <w:rsid w:val="00ED75E1"/>
+  </w:style>
+  <w:style w:type="paragraph" w:styleId="Piedepgina">
+    <w:name w:val="footer"/>
+    <w:basedOn w:val="Normal"/>
+    <w:link w:val="PiedepginaCar"/>
+    <w:uiPriority w:val="99"/>
+    <w:unhideWhenUsed/>
+    <w:rsid w:val="00ED75E1"/>
+    <w:pPr>
+      <w:tabs>
+        <w:tab w:val="center" w:pos="4419"/>
+        <w:tab w:val="right" w:pos="8838"/>
+      </w:tabs>
+      <w:spacing w:after="0" w:line="240" w:lineRule="auto"/>
+    </w:pPr>
+  </w:style>
+  <w:style w:type="character" w:customStyle="1" w:styleId="PiedepginaCar">
+    <w:name w:val="Pie de página Car"/>
+    <w:basedOn w:val="Fuentedeprrafopredeter"/>
+    <w:link w:val="Piedepgina"/>
+    <w:uiPriority w:val="99"/>
+    <w:rsid w:val="00ED75E1"/>
+  </w:style>
+  <w:style w:type="paragraph" w:styleId="NormalWeb">
+    <w:name w:val="Normal (Web)"/>
+    <w:basedOn w:val="Normal"/>
+    <w:uiPriority w:val="99"/>
+    <w:semiHidden/>
+    <w:unhideWhenUsed/>
+    <w:rsid w:val="005A38F3"/>
+    <w:pPr>
+      <w:spacing w:before="100" w:beforeAutospacing="1" w:after="100" w:afterAutospacing="1" w:line="240" w:lineRule="auto"/>
+    </w:pPr>
+    <w:rPr>
+      <w:rFonts w:ascii="Times New Roman" w:eastAsia="Times New Roman" w:hAnsi="Times New Roman" w:cs="Times New Roman"/>
+      <w:sz w:val="24"/>
+      <w:szCs w:val="24"/>
+      <w:lang w:eastAsia="es-CL"/>
+    </w:rPr>
+  </w:style>
 </w:styles>
 </file>
 

</xml_diff>